<commit_message>
docs: atualiza status PiAPI - imagem/áudio/vídeo funcionando
</commit_message>
<xml_diff>
--- a/PIAPI_INTEGRACAO_STATUS.docx
+++ b/PIAPI_INTEGRACAO_STATUS.docx
@@ -2,7 +2,7 @@
 <file path=word/document.xml><?xml version="1.0" encoding="utf-8"?>
 <w:document xmlns:w="http://schemas.openxmlformats.org/wordprocessingml/2006/main" xmlns:m="http://schemas.openxmlformats.org/officeDocument/2006/math" xmlns:r="http://schemas.openxmlformats.org/officeDocument/2006/relationships" xmlns:o="urn:schemas-microsoft-com:office:office" xmlns:v="urn:schemas-microsoft-com:vml" xmlns:w10="urn:schemas-microsoft-com:office:word" xmlns:a="http://schemas.openxmlformats.org/drawingml/2006/main" xmlns:pic="http://schemas.openxmlformats.org/drawingml/2006/picture" xmlns:wp="http://schemas.openxmlformats.org/drawingml/2006/wordprocessingDrawing">
   <w:body>
-    <w:bookmarkStart w:id="41" w:name="status-da-integração-piapi---fluxyra"/>
+    <w:bookmarkStart w:id="42" w:name="status-da-integração-piapi---fluxyra"/>
     <w:p>
       <w:pPr>
         <w:pStyle w:val="Heading1"/>
@@ -58,7 +58,7 @@
         <w:t xml:space="preserve"> </w:t>
       </w:r>
       <w:r>
-        <w:t xml:space="preserve">- Geração de imagens testada com sucesso</w:t>
+        <w:t xml:space="preserve">- Imagem, Áudio e Vídeo testados end-to-end com sucesso</w:t>
       </w:r>
     </w:p>
     <w:p>
@@ -68,7 +68,7 @@
         </w:pict>
       </w:r>
     </w:p>
-    <w:bookmarkStart w:id="20" w:name="resumo-executivo"/>
+    <w:bookmarkStart w:id="21" w:name="resumo-executivo"/>
     <w:p>
       <w:pPr>
         <w:pStyle w:val="Heading2"/>
@@ -98,7 +98,20 @@
         <w:t xml:space="preserve"> </w:t>
       </w:r>
       <w:r>
-        <w:t xml:space="preserve">está funcionando e gerando imagens reais. Realizamos teste end-to-end com sucesso:</w:t>
+        <w:t xml:space="preserve">está funcionando para as</w:t>
+      </w:r>
+      <w:r>
+        <w:t xml:space="preserve"> </w:t>
+      </w:r>
+      <w:r>
+        <w:rPr>
+          <w:bCs/>
+          <w:b/>
+        </w:rPr>
+        <w:t xml:space="preserve">três modalidades</w:t>
+      </w:r>
+      <w:r>
+        <w:t xml:space="preserve">. Fluxo completo validado no navegador (login → prompt → geração → mídia aparece na galeria automaticamente → créditos debitados → mídia persistida no Supabase Storage):</w:t>
       </w:r>
     </w:p>
     <w:p>
@@ -110,7 +123,32 @@
         <w:pStyle w:val="Compact"/>
       </w:pPr>
       <w:r>
-        <w:t xml:space="preserve">✅ Chave de API configurada</w:t>
+        <w:t xml:space="preserve">✅</w:t>
+      </w:r>
+      <w:r>
+        <w:t xml:space="preserve"> </w:t>
+      </w:r>
+      <w:r>
+        <w:rPr>
+          <w:bCs/>
+          <w:b/>
+        </w:rPr>
+        <w:t xml:space="preserve">Imagem</w:t>
+      </w:r>
+      <w:r>
+        <w:t xml:space="preserve"> </w:t>
+      </w:r>
+      <w:r>
+        <w:t xml:space="preserve">— Flux Schnell (</w:t>
+      </w:r>
+      <w:r>
+        <w:rPr>
+          <w:rStyle w:val="VerbatimChar"/>
+        </w:rPr>
+        <w:t xml:space="preserve">Qubico/flux1-schnell</w:t>
+      </w:r>
+      <w:r>
+        <w:t xml:space="preserve">), ~15s</w:t>
       </w:r>
     </w:p>
     <w:p>
@@ -122,7 +160,32 @@
         <w:pStyle w:val="Compact"/>
       </w:pPr>
       <w:r>
-        <w:t xml:space="preserve">✅ Modelos Flux cadastrados no banco de dados</w:t>
+        <w:t xml:space="preserve">✅</w:t>
+      </w:r>
+      <w:r>
+        <w:t xml:space="preserve"> </w:t>
+      </w:r>
+      <w:r>
+        <w:rPr>
+          <w:bCs/>
+          <w:b/>
+        </w:rPr>
+        <w:t xml:space="preserve">Áudio</w:t>
+      </w:r>
+      <w:r>
+        <w:t xml:space="preserve"> </w:t>
+      </w:r>
+      <w:r>
+        <w:t xml:space="preserve">— Ace-Step (</w:t>
+      </w:r>
+      <w:r>
+        <w:rPr>
+          <w:rStyle w:val="VerbatimChar"/>
+        </w:rPr>
+        <w:t xml:space="preserve">Qubico/ace-step</w:t>
+      </w:r>
+      <w:r>
+        <w:t xml:space="preserve">), música gerada com player na galeria</w:t>
       </w:r>
     </w:p>
     <w:p>
@@ -134,7 +197,47 @@
         <w:pStyle w:val="Compact"/>
       </w:pPr>
       <w:r>
-        <w:t xml:space="preserve">✅ Geração de imagem via Flux Schnell concluída</w:t>
+        <w:t xml:space="preserve">✅</w:t>
+      </w:r>
+      <w:r>
+        <w:t xml:space="preserve"> </w:t>
+      </w:r>
+      <w:r>
+        <w:rPr>
+          <w:bCs/>
+          <w:b/>
+        </w:rPr>
+        <w:t xml:space="preserve">Vídeo</w:t>
+      </w:r>
+      <w:r>
+        <w:t xml:space="preserve"> </w:t>
+      </w:r>
+      <w:r>
+        <w:t xml:space="preserve">— Seedance 2.0 (</w:t>
+      </w:r>
+      <w:r>
+        <w:rPr>
+          <w:rStyle w:val="VerbatimChar"/>
+        </w:rPr>
+        <w:t xml:space="preserve">seedance</w:t>
+      </w:r>
+      <w:r>
+        <w:t xml:space="preserve"> </w:t>
+      </w:r>
+      <w:r>
+        <w:t xml:space="preserve">/</w:t>
+      </w:r>
+      <w:r>
+        <w:t xml:space="preserve"> </w:t>
+      </w:r>
+      <w:r>
+        <w:rPr>
+          <w:rStyle w:val="VerbatimChar"/>
+        </w:rPr>
+        <w:t xml:space="preserve">task_type: seedance-2</w:t>
+      </w:r>
+      <w:r>
+        <w:t xml:space="preserve">), vídeo gerado com player na galeria</w:t>
       </w:r>
     </w:p>
     <w:p>
@@ -146,7 +249,7 @@
         <w:pStyle w:val="Compact"/>
       </w:pPr>
       <w:r>
-        <w:t xml:space="preserve">✅ Créditos debitados corretamente (10 → 9 créditos)</w:t>
+        <w:t xml:space="preserve">✅ Créditos debitados corretamente por geração</w:t>
       </w:r>
     </w:p>
     <w:p>
@@ -158,7 +261,7 @@
         <w:pStyle w:val="Compact"/>
       </w:pPr>
       <w:r>
-        <w:t xml:space="preserve">✅ Task ID salvo no banco de dados</w:t>
+        <w:t xml:space="preserve">✅ Polling de status a cada 3s até a conclusão</w:t>
       </w:r>
     </w:p>
     <w:p>
@@ -170,7 +273,426 @@
         <w:pStyle w:val="Compact"/>
       </w:pPr>
       <w:r>
-        <w:t xml:space="preserve">✅ Imagem gerada: [https://build.nvidia.com/_next/image?url=https%3A%2F%2Fassets.ngc.nvidia.com%2Fproducts%2Fapi-catalog%2Fimages%2Fflux_1-schnell.jpg&amp;w=3840&amp;q=75</w:t>
+        <w:t xml:space="preserve">✅ Mídia baixada do provedor e persistida no Supabase Storage (bucket</w:t>
+      </w:r>
+      <w:r>
+        <w:t xml:space="preserve"> </w:t>
+      </w:r>
+      <w:r>
+        <w:rPr>
+          <w:rStyle w:val="VerbatimChar"/>
+        </w:rPr>
+        <w:t xml:space="preserve">assets</w:t>
+      </w:r>
+      <w:r>
+        <w:t xml:space="preserve">, via service-role)</w:t>
+      </w:r>
+    </w:p>
+    <w:p>
+      <w:pPr>
+        <w:numPr>
+          <w:ilvl w:val="0"/>
+          <w:numId w:val="1001"/>
+        </w:numPr>
+        <w:pStyle w:val="Compact"/>
+      </w:pPr>
+      <w:r>
+        <w:t xml:space="preserve">✅</w:t>
+      </w:r>
+      <w:r>
+        <w:t xml:space="preserve"> </w:t>
+      </w:r>
+      <w:r>
+        <w:rPr>
+          <w:rStyle w:val="VerbatimChar"/>
+        </w:rPr>
+        <w:t xml:space="preserve">result_url</w:t>
+      </w:r>
+      <w:r>
+        <w:t xml:space="preserve"> </w:t>
+      </w:r>
+      <w:r>
+        <w:t xml:space="preserve">final aponta para o Storage do Supabase (não a URL temporária do provedor)</w:t>
+      </w:r>
+    </w:p>
+    <w:bookmarkStart w:id="20" w:name="formatos-de-payload-descobertos-piapi"/>
+    <w:p>
+      <w:pPr>
+        <w:pStyle w:val="Heading3"/>
+      </w:pPr>
+      <w:r>
+        <w:t xml:space="preserve">Formatos de payload descobertos (PiAPI)</w:t>
+      </w:r>
+    </w:p>
+    <w:tbl>
+      <w:tblPr>
+        <w:tblStyle w:val="Table"/>
+        <w:tblW w:type="pct" w:w="5000"/>
+        <w:tblLook w:firstRow="1" w:lastRow="0" w:firstColumn="0" w:lastColumn="0" w:noHBand="0" w:noVBand="0" w:val="0020"/>
+      </w:tblPr>
+      <w:tblGrid>
+        <w:gridCol w:w="1893"/>
+        <w:gridCol w:w="1205"/>
+        <w:gridCol w:w="1893"/>
+        <w:gridCol w:w="2926"/>
+      </w:tblGrid>
+      <w:tr>
+        <w:trPr>
+          <w:tblHeader w:val="true"/>
+        </w:trPr>
+        <w:tc>
+          <w:tcPr/>
+          <w:p>
+            <w:pPr>
+              <w:pStyle w:val="Compact"/>
+              <w:jc w:val="left"/>
+            </w:pPr>
+            <w:r>
+              <w:t xml:space="preserve">Modalidade</w:t>
+            </w:r>
+          </w:p>
+        </w:tc>
+        <w:tc>
+          <w:tcPr/>
+          <w:p>
+            <w:pPr>
+              <w:pStyle w:val="Compact"/>
+              <w:jc w:val="left"/>
+            </w:pPr>
+            <w:r>
+              <w:t xml:space="preserve">model</w:t>
+            </w:r>
+          </w:p>
+        </w:tc>
+        <w:tc>
+          <w:tcPr/>
+          <w:p>
+            <w:pPr>
+              <w:pStyle w:val="Compact"/>
+              <w:jc w:val="left"/>
+            </w:pPr>
+            <w:r>
+              <w:t xml:space="preserve">task_type</w:t>
+            </w:r>
+          </w:p>
+        </w:tc>
+        <w:tc>
+          <w:tcPr/>
+          <w:p>
+            <w:pPr>
+              <w:pStyle w:val="Compact"/>
+              <w:jc w:val="left"/>
+            </w:pPr>
+            <w:r>
+              <w:t xml:space="preserve">campos de input</w:t>
+            </w:r>
+          </w:p>
+        </w:tc>
+      </w:tr>
+      <w:tr>
+        <w:tc>
+          <w:tcPr/>
+          <w:p>
+            <w:pPr>
+              <w:pStyle w:val="Compact"/>
+              <w:jc w:val="left"/>
+            </w:pPr>
+            <w:r>
+              <w:t xml:space="preserve">Imagem</w:t>
+            </w:r>
+          </w:p>
+        </w:tc>
+        <w:tc>
+          <w:tcPr/>
+          <w:p>
+            <w:pPr>
+              <w:pStyle w:val="Compact"/>
+              <w:jc w:val="left"/>
+            </w:pPr>
+            <w:r>
+              <w:rPr>
+                <w:rStyle w:val="VerbatimChar"/>
+              </w:rPr>
+              <w:t xml:space="preserve">Qubico/flux1-schnell</w:t>
+            </w:r>
+          </w:p>
+        </w:tc>
+        <w:tc>
+          <w:tcPr/>
+          <w:p>
+            <w:pPr>
+              <w:pStyle w:val="Compact"/>
+              <w:jc w:val="left"/>
+            </w:pPr>
+            <w:r>
+              <w:rPr>
+                <w:rStyle w:val="VerbatimChar"/>
+              </w:rPr>
+              <w:t xml:space="preserve">txt2img</w:t>
+            </w:r>
+          </w:p>
+        </w:tc>
+        <w:tc>
+          <w:tcPr/>
+          <w:p>
+            <w:pPr>
+              <w:pStyle w:val="Compact"/>
+              <w:jc w:val="left"/>
+            </w:pPr>
+            <w:r>
+              <w:rPr>
+                <w:rStyle w:val="VerbatimChar"/>
+              </w:rPr>
+              <w:t xml:space="preserve">prompt</w:t>
+            </w:r>
+            <w:r>
+              <w:t xml:space="preserve">,</w:t>
+            </w:r>
+            <w:r>
+              <w:t xml:space="preserve"> </w:t>
+            </w:r>
+            <w:r>
+              <w:rPr>
+                <w:rStyle w:val="VerbatimChar"/>
+              </w:rPr>
+              <w:t xml:space="preserve">width</w:t>
+            </w:r>
+            <w:r>
+              <w:t xml:space="preserve">,</w:t>
+            </w:r>
+            <w:r>
+              <w:t xml:space="preserve"> </w:t>
+            </w:r>
+            <w:r>
+              <w:rPr>
+                <w:rStyle w:val="VerbatimChar"/>
+              </w:rPr>
+              <w:t xml:space="preserve">height</w:t>
+            </w:r>
+          </w:p>
+        </w:tc>
+      </w:tr>
+      <w:tr>
+        <w:tc>
+          <w:tcPr/>
+          <w:p>
+            <w:pPr>
+              <w:pStyle w:val="Compact"/>
+              <w:jc w:val="left"/>
+            </w:pPr>
+            <w:r>
+              <w:t xml:space="preserve">Áudio</w:t>
+            </w:r>
+          </w:p>
+        </w:tc>
+        <w:tc>
+          <w:tcPr/>
+          <w:p>
+            <w:pPr>
+              <w:pStyle w:val="Compact"/>
+              <w:jc w:val="left"/>
+            </w:pPr>
+            <w:r>
+              <w:rPr>
+                <w:rStyle w:val="VerbatimChar"/>
+              </w:rPr>
+              <w:t xml:space="preserve">Qubico/ace-step</w:t>
+            </w:r>
+          </w:p>
+        </w:tc>
+        <w:tc>
+          <w:tcPr/>
+          <w:p>
+            <w:pPr>
+              <w:pStyle w:val="Compact"/>
+              <w:jc w:val="left"/>
+            </w:pPr>
+            <w:r>
+              <w:rPr>
+                <w:rStyle w:val="VerbatimChar"/>
+              </w:rPr>
+              <w:t xml:space="preserve">txt2audio</w:t>
+            </w:r>
+          </w:p>
+        </w:tc>
+        <w:tc>
+          <w:tcPr/>
+          <w:p>
+            <w:pPr>
+              <w:pStyle w:val="Compact"/>
+              <w:jc w:val="left"/>
+            </w:pPr>
+            <w:r>
+              <w:rPr>
+                <w:rStyle w:val="VerbatimChar"/>
+              </w:rPr>
+              <w:t xml:space="preserve">style_prompt</w:t>
+            </w:r>
+            <w:r>
+              <w:t xml:space="preserve">,</w:t>
+            </w:r>
+            <w:r>
+              <w:t xml:space="preserve"> </w:t>
+            </w:r>
+            <w:r>
+              <w:rPr>
+                <w:rStyle w:val="VerbatimChar"/>
+              </w:rPr>
+              <w:t xml:space="preserve">lyrics</w:t>
+            </w:r>
+          </w:p>
+        </w:tc>
+      </w:tr>
+      <w:tr>
+        <w:tc>
+          <w:tcPr/>
+          <w:p>
+            <w:pPr>
+              <w:pStyle w:val="Compact"/>
+              <w:jc w:val="left"/>
+            </w:pPr>
+            <w:r>
+              <w:t xml:space="preserve">Vídeo</w:t>
+            </w:r>
+          </w:p>
+        </w:tc>
+        <w:tc>
+          <w:tcPr/>
+          <w:p>
+            <w:pPr>
+              <w:pStyle w:val="Compact"/>
+              <w:jc w:val="left"/>
+            </w:pPr>
+            <w:r>
+              <w:rPr>
+                <w:rStyle w:val="VerbatimChar"/>
+              </w:rPr>
+              <w:t xml:space="preserve">seedance</w:t>
+            </w:r>
+          </w:p>
+        </w:tc>
+        <w:tc>
+          <w:tcPr/>
+          <w:p>
+            <w:pPr>
+              <w:pStyle w:val="Compact"/>
+              <w:jc w:val="left"/>
+            </w:pPr>
+            <w:r>
+              <w:rPr>
+                <w:rStyle w:val="VerbatimChar"/>
+              </w:rPr>
+              <w:t xml:space="preserve">seedance-2</w:t>
+            </w:r>
+          </w:p>
+        </w:tc>
+        <w:tc>
+          <w:tcPr/>
+          <w:p>
+            <w:pPr>
+              <w:pStyle w:val="Compact"/>
+              <w:jc w:val="left"/>
+            </w:pPr>
+            <w:r>
+              <w:rPr>
+                <w:rStyle w:val="VerbatimChar"/>
+              </w:rPr>
+              <w:t xml:space="preserve">prompt</w:t>
+            </w:r>
+            <w:r>
+              <w:t xml:space="preserve">,</w:t>
+            </w:r>
+            <w:r>
+              <w:t xml:space="preserve"> </w:t>
+            </w:r>
+            <w:r>
+              <w:rPr>
+                <w:rStyle w:val="VerbatimChar"/>
+              </w:rPr>
+              <w:t xml:space="preserve">aspect_ratio</w:t>
+            </w:r>
+            <w:r>
+              <w:t xml:space="preserve">,</w:t>
+            </w:r>
+            <w:r>
+              <w:t xml:space="preserve"> </w:t>
+            </w:r>
+            <w:r>
+              <w:rPr>
+                <w:rStyle w:val="VerbatimChar"/>
+              </w:rPr>
+              <w:t xml:space="preserve">duration</w:t>
+            </w:r>
+            <w:r>
+              <w:t xml:space="preserve">,</w:t>
+            </w:r>
+            <w:r>
+              <w:t xml:space="preserve"> </w:t>
+            </w:r>
+            <w:r>
+              <w:rPr>
+                <w:rStyle w:val="VerbatimChar"/>
+              </w:rPr>
+              <w:t xml:space="preserve">resolution</w:t>
+            </w:r>
+          </w:p>
+        </w:tc>
+      </w:tr>
+    </w:tbl>
+    <w:p>
+      <w:pPr>
+        <w:pStyle w:val="BodyText"/>
+      </w:pPr>
+      <w:r>
+        <w:t xml:space="preserve">Resposta da PiAPI segue o formato</w:t>
+      </w:r>
+      <w:r>
+        <w:t xml:space="preserve"> </w:t>
+      </w:r>
+      <w:r>
+        <w:rPr>
+          <w:rStyle w:val="VerbatimChar"/>
+        </w:rPr>
+        <w:t xml:space="preserve">{ code, data: { task_id, status, output, error } }</w:t>
+      </w:r>
+      <w:r>
+        <w:t xml:space="preserve">. Output por tipo: imagem</w:t>
+      </w:r>
+      <w:r>
+        <w:t xml:space="preserve"> </w:t>
+      </w:r>
+      <w:r>
+        <w:rPr>
+          <w:rStyle w:val="VerbatimChar"/>
+        </w:rPr>
+        <w:t xml:space="preserve">image_url</w:t>
+      </w:r>
+      <w:r>
+        <w:t xml:space="preserve">, áudio</w:t>
+      </w:r>
+      <w:r>
+        <w:t xml:space="preserve"> </w:t>
+      </w:r>
+      <w:r>
+        <w:rPr>
+          <w:rStyle w:val="VerbatimChar"/>
+        </w:rPr>
+        <w:t xml:space="preserve">audio_url</w:t>
+      </w:r>
+      <w:r>
+        <w:t xml:space="preserve">, vídeo</w:t>
+      </w:r>
+      <w:r>
+        <w:t xml:space="preserve"> </w:t>
+      </w:r>
+      <w:r>
+        <w:rPr>
+          <w:rStyle w:val="VerbatimChar"/>
+        </w:rPr>
+        <w:t xml:space="preserve">video</w:t>
+      </w:r>
+      <w:r>
+        <w:t xml:space="preserve">.</w:t>
       </w:r>
     </w:p>
     <w:p>
@@ -181,7 +703,8 @@
       </w:r>
     </w:p>
     <w:bookmarkEnd w:id="20"/>
-    <w:bookmarkStart w:id="21" w:name="credenciais-configuradas"/>
+    <w:bookmarkEnd w:id="21"/>
+    <w:bookmarkStart w:id="22" w:name="credenciais-configuradas"/>
     <w:p>
       <w:pPr>
         <w:pStyle w:val="Heading2"/>
@@ -266,8 +789,8 @@
         </w:pict>
       </w:r>
     </w:p>
-    <w:bookmarkEnd w:id="21"/>
-    <w:bookmarkStart w:id="25" w:name="correções-implementadas"/>
+    <w:bookmarkEnd w:id="22"/>
+    <w:bookmarkStart w:id="26" w:name="correções-implementadas"/>
     <w:p>
       <w:pPr>
         <w:pStyle w:val="Heading2"/>
@@ -276,7 +799,7 @@
         <w:t xml:space="preserve">🛠️ Correções Implementadas</w:t>
       </w:r>
     </w:p>
-    <w:bookmarkStart w:id="22" w:name="nomes-dos-modelos-flux"/>
+    <w:bookmarkStart w:id="23" w:name="nomes-dos-modelos-flux"/>
     <w:p>
       <w:pPr>
         <w:pStyle w:val="Heading3"/>
@@ -506,8 +1029,8 @@
         </w:tc>
       </w:tr>
     </w:tbl>
-    <w:bookmarkEnd w:id="22"/>
-    <w:bookmarkStart w:id="23" w:name="estrutura-de-resposta-da-api"/>
+    <w:bookmarkEnd w:id="23"/>
+    <w:bookmarkStart w:id="24" w:name="estrutura-de-resposta-da-api"/>
     <w:p>
       <w:pPr>
         <w:pStyle w:val="Heading3"/>
@@ -862,8 +1385,8 @@
         <w:t xml:space="preserve">task.data.task_id</w:t>
       </w:r>
     </w:p>
-    <w:bookmarkEnd w:id="23"/>
-    <w:bookmarkStart w:id="24" w:name="arquivos-modificados"/>
+    <w:bookmarkEnd w:id="24"/>
+    <w:bookmarkStart w:id="25" w:name="arquivos-modificados"/>
     <w:p>
       <w:pPr>
         <w:pStyle w:val="Heading3"/>
@@ -952,9 +1475,9 @@
         </w:pict>
       </w:r>
     </w:p>
-    <w:bookmarkEnd w:id="24"/>
     <w:bookmarkEnd w:id="25"/>
-    <w:bookmarkStart w:id="29" w:name="teste-end-to-end-realizado"/>
+    <w:bookmarkEnd w:id="26"/>
+    <w:bookmarkStart w:id="30" w:name="teste-end-to-end-realizado"/>
     <w:p>
       <w:pPr>
         <w:pStyle w:val="Heading2"/>
@@ -963,7 +1486,7 @@
         <w:t xml:space="preserve">🧪 Teste End-to-End Realizado</w:t>
       </w:r>
     </w:p>
-    <w:bookmarkStart w:id="26" w:name="entrada"/>
+    <w:bookmarkStart w:id="27" w:name="entrada"/>
     <w:p>
       <w:pPr>
         <w:pStyle w:val="Heading3"/>
@@ -1142,8 +1665,8 @@
         <w:t xml:space="preserve">}</w:t>
       </w:r>
     </w:p>
-    <w:bookmarkEnd w:id="26"/>
-    <w:bookmarkStart w:id="27" w:name="fluxo-completo"/>
+    <w:bookmarkEnd w:id="27"/>
+    <w:bookmarkStart w:id="28" w:name="fluxo-completo"/>
     <w:p>
       <w:pPr>
         <w:pStyle w:val="Heading3"/>
@@ -1332,8 +1855,8 @@
         <w:t xml:space="preserve">✅ Imagem gerada com sucesso</w:t>
       </w:r>
     </w:p>
-    <w:bookmarkEnd w:id="27"/>
-    <w:bookmarkStart w:id="28" w:name="resultado"/>
+    <w:bookmarkEnd w:id="28"/>
+    <w:bookmarkStart w:id="29" w:name="resultado"/>
     <w:p>
       <w:pPr>
         <w:pStyle w:val="Heading3"/>
@@ -1401,9 +1924,9 @@
         </w:pict>
       </w:r>
     </w:p>
-    <w:bookmarkEnd w:id="28"/>
     <w:bookmarkEnd w:id="29"/>
-    <w:bookmarkStart w:id="33" w:name="estado-atual-do-banco-de-dados"/>
+    <w:bookmarkEnd w:id="30"/>
+    <w:bookmarkStart w:id="34" w:name="estado-atual-do-banco-de-dados"/>
     <w:p>
       <w:pPr>
         <w:pStyle w:val="Heading2"/>
@@ -1412,7 +1935,7 @@
         <w:t xml:space="preserve">📊 Estado Atual do Banco de Dados</w:t>
       </w:r>
     </w:p>
-    <w:bookmarkStart w:id="30" w:name="modelos-ativos-de-imagem-piapi"/>
+    <w:bookmarkStart w:id="31" w:name="modelos-ativos-de-imagem-piapi"/>
     <w:p>
       <w:pPr>
         <w:pStyle w:val="Heading3"/>
@@ -1450,8 +1973,8 @@
         <w:t xml:space="preserve">✅ Flux Schnell        - Qubico/flux1-schnell      - 1 crédito ⭐ TESTADO</w:t>
       </w:r>
     </w:p>
-    <w:bookmarkEnd w:id="30"/>
-    <w:bookmarkStart w:id="31" w:name="última-geração"/>
+    <w:bookmarkEnd w:id="31"/>
+    <w:bookmarkStart w:id="32" w:name="última-geração"/>
     <w:p>
       <w:pPr>
         <w:pStyle w:val="Heading3"/>
@@ -1507,8 +2030,8 @@
         <w:t xml:space="preserve">Criado em: 2026-07-24T03:17:32.347333+00:00</w:t>
       </w:r>
     </w:p>
-    <w:bookmarkEnd w:id="31"/>
-    <w:bookmarkStart w:id="32" w:name="saldo-do-usuário-de-teste"/>
+    <w:bookmarkEnd w:id="32"/>
+    <w:bookmarkStart w:id="33" w:name="saldo-do-usuário-de-teste"/>
     <w:p>
       <w:pPr>
         <w:pStyle w:val="Heading3"/>
@@ -1553,9 +2076,9 @@
         </w:pict>
       </w:r>
     </w:p>
-    <w:bookmarkEnd w:id="32"/>
     <w:bookmarkEnd w:id="33"/>
-    <w:bookmarkStart w:id="38" w:name="próximos-passos-pendentes"/>
+    <w:bookmarkEnd w:id="34"/>
+    <w:bookmarkStart w:id="39" w:name="próximos-passos-pendentes"/>
     <w:p>
       <w:pPr>
         <w:pStyle w:val="Heading2"/>
@@ -1564,7 +2087,7 @@
         <w:t xml:space="preserve">⚠️ Próximos Passos (Pendentes)</w:t>
       </w:r>
     </w:p>
-    <w:bookmarkStart w:id="34" w:name="webhook-ou-polling-para-resultado"/>
+    <w:bookmarkStart w:id="35" w:name="webhook-ou-polling-para-resultado"/>
     <w:p>
       <w:pPr>
         <w:pStyle w:val="Heading3"/>
@@ -1735,8 +2258,8 @@
         <w:t xml:space="preserve">- [ ] Implementar polling job (verificar status periodicamente)</w:t>
       </w:r>
     </w:p>
-    <w:bookmarkEnd w:id="34"/>
-    <w:bookmarkStart w:id="35" w:name="download-e-storage"/>
+    <w:bookmarkEnd w:id="35"/>
+    <w:bookmarkStart w:id="36" w:name="download-e-storage"/>
     <w:p>
       <w:pPr>
         <w:pStyle w:val="Heading3"/>
@@ -1833,8 +2356,8 @@
         <w:t xml:space="preserve">público</w:t>
       </w:r>
     </w:p>
-    <w:bookmarkEnd w:id="35"/>
-    <w:bookmarkStart w:id="36" w:name="exibição-no-frontend"/>
+    <w:bookmarkEnd w:id="36"/>
+    <w:bookmarkStart w:id="37" w:name="exibição-no-frontend"/>
     <w:p>
       <w:pPr>
         <w:pStyle w:val="Heading3"/>
@@ -1904,8 +2427,8 @@
         <w:t xml:space="preserve">☐ Exibir imagens na galeria quando concluídas</w:t>
       </w:r>
     </w:p>
-    <w:bookmarkEnd w:id="36"/>
-    <w:bookmarkStart w:id="37" w:name="modelos-de-vídeo-e-áudio"/>
+    <w:bookmarkEnd w:id="37"/>
+    <w:bookmarkStart w:id="38" w:name="modelos-de-vídeo-e-áudio"/>
     <w:p>
       <w:pPr>
         <w:pStyle w:val="Heading3"/>
@@ -1967,9 +2490,9 @@
         </w:pict>
       </w:r>
     </w:p>
-    <w:bookmarkEnd w:id="37"/>
     <w:bookmarkEnd w:id="38"/>
-    <w:bookmarkStart w:id="39" w:name="git-status"/>
+    <w:bookmarkEnd w:id="39"/>
+    <w:bookmarkStart w:id="40" w:name="git-status"/>
     <w:p>
       <w:pPr>
         <w:pStyle w:val="Heading2"/>
@@ -2074,8 +2597,8 @@
         </w:pict>
       </w:r>
     </w:p>
-    <w:bookmarkEnd w:id="39"/>
-    <w:bookmarkStart w:id="40" w:name="conclusão"/>
+    <w:bookmarkEnd w:id="40"/>
+    <w:bookmarkStart w:id="41" w:name="conclusão"/>
     <w:p>
       <w:pPr>
         <w:pStyle w:val="Heading2"/>
@@ -2157,8 +2680,8 @@
         <w:t xml:space="preserve">PRONTO PARA PRODUÇÃO (com webhook pendente)</w:t>
       </w:r>
     </w:p>
-    <w:bookmarkEnd w:id="40"/>
     <w:bookmarkEnd w:id="41"/>
+    <w:bookmarkEnd w:id="42"/>
     <w:sectPr/>
   </w:body>
 </w:document>

</xml_diff>